<commit_message>
docs: actualizar diagramas y documentos con materia, docente y proveedor Gemini
</commit_message>
<xml_diff>
--- a/docs/ARQUITECTURA.docx
+++ b/docs/ARQUITECTURA.docx
@@ -16,6 +16,19 @@
           <w:sz w:val="28"/>
         </w:rPr>
         <w:t>TECNOLOGÍA EN DESARROLLO DE SOFTWARE</w:t>
+      </w:r>
+    </w:p>
+    <w:p>
+      <w:pPr>
+        <w:jc w:val="center"/>
+      </w:pPr>
+      <w:r>
+        <w:rPr>
+          <w:b w:val="0"/>
+          <w:i w:val="0"/>
+          <w:sz w:val="22"/>
+        </w:rPr>
+        <w:t>PROGRAMACIÓN AVANZADA Y APLICADA</w:t>
       </w:r>
     </w:p>
     <w:p/>
@@ -112,6 +125,33 @@
               <w:rPr>
                 <w:b/>
               </w:rPr>
+              <w:t>Docente</w:t>
+            </w:r>
+          </w:p>
+        </w:tc>
+        <w:tc>
+          <w:tcPr>
+            <w:tcW w:type="dxa" w:w="6236"/>
+          </w:tcPr>
+          <w:p>
+            <w:r>
+              <w:t>Mg. Sandra Esperanza Sánchez Barragán</w:t>
+            </w:r>
+          </w:p>
+        </w:tc>
+      </w:tr>
+      <w:tr>
+        <w:tc>
+          <w:tcPr>
+            <w:tcW w:type="dxa" w:w="2268"/>
+            <w:shd w:val="clear" w:color="auto" w:fill="DCE8FB"/>
+          </w:tcPr>
+          <w:p>
+            <w:r/>
+            <w:r>
+              <w:rPr>
+                <w:b/>
+              </w:rPr>
               <w:t>Programa</w:t>
             </w:r>
           </w:p>
@@ -123,6 +163,60 @@
           <w:p>
             <w:r>
               <w:t>Tecnología en Desarrollo de Software</w:t>
+            </w:r>
+          </w:p>
+        </w:tc>
+      </w:tr>
+      <w:tr>
+        <w:tc>
+          <w:tcPr>
+            <w:tcW w:type="dxa" w:w="2268"/>
+            <w:shd w:val="clear" w:color="auto" w:fill="DCE8FB"/>
+          </w:tcPr>
+          <w:p>
+            <w:r/>
+            <w:r>
+              <w:rPr>
+                <w:b/>
+              </w:rPr>
+              <w:t>Materia</w:t>
+            </w:r>
+          </w:p>
+        </w:tc>
+        <w:tc>
+          <w:tcPr>
+            <w:tcW w:type="dxa" w:w="6236"/>
+          </w:tcPr>
+          <w:p>
+            <w:r>
+              <w:t>Programación Avanzada y Aplicada</w:t>
+            </w:r>
+          </w:p>
+        </w:tc>
+      </w:tr>
+      <w:tr>
+        <w:tc>
+          <w:tcPr>
+            <w:tcW w:type="dxa" w:w="2268"/>
+            <w:shd w:val="clear" w:color="auto" w:fill="DCE8FB"/>
+          </w:tcPr>
+          <w:p>
+            <w:r/>
+            <w:r>
+              <w:rPr>
+                <w:b/>
+              </w:rPr>
+              <w:t>Modalidad</w:t>
+            </w:r>
+          </w:p>
+        </w:tc>
+        <w:tc>
+          <w:tcPr>
+            <w:tcW w:type="dxa" w:w="6236"/>
+          </w:tcPr>
+          <w:p>
+            <w:r>
+              <w:t>Individual</w:t>
             </w:r>
           </w:p>
         </w:tc>
@@ -793,7 +887,7 @@
               <w:rPr>
                 <w:sz w:val="18"/>
               </w:rPr>
-              <w:t>OpenAiCompatibleClient</w:t>
+              <w:t>ChatCompletionsClient</w:t>
             </w:r>
           </w:p>
         </w:tc>
@@ -935,7 +1029,7 @@
         <w:pStyle w:val="ListNumber"/>
       </w:pPr>
       <w:r>
-        <w:t>AiService → OpenAiCompatibleClient → POST chat/completions.</w:t>
+        <w:t>AiService → ChatCompletionsClient → POST chat/completions.</w:t>
       </w:r>
     </w:p>
     <w:p>
@@ -1021,7 +1115,7 @@
       <w:jc w:val="center"/>
     </w:pPr>
     <w:r>
-      <w:t xml:space="preserve">AsistenteIA -- Arquitectura        Página </w:t>
+      <w:t xml:space="preserve">Programación Avanzada y Aplicada — AsistenteIA: Arquitectura        Página </w:t>
     </w:r>
     <w:r>
       <w:fldChar w:fldCharType="begin"/>

</xml_diff>